<commit_message>
Completa dashboard, metadatos y validaciones del Hito 3
</commit_message>
<xml_diff>
--- a/docs/Diccionario_Datos.docx
+++ b/docs/Diccionario_Datos.docx
@@ -3322,15 +3322,7 @@
         <w:spacing w:after="50" w:before="180"/>
       </w:pPr>
       <w:r>
-        <w:rPr>
-          <w:rFonts w:ascii="Arial" w:cs="Arial" w:eastAsia="Arial" w:hAnsi="Arial"/>
-          <w:b/>
-          <w:bCs/>
-          <w:color w:val="2E5FA3"/>
-          <w:sz w:val="21"/>
-          <w:szCs w:val="21"/>
-        </w:rPr>
-        <w:t xml:space="preserve">Tasas del mercado laboral · 5 columnas</w:t>
+        <w:t>Tasas del mercado laboral · 9 columnas</w:t>
       </w:r>
     </w:p>
     <w:p>
@@ -3510,6 +3502,258 @@
               <w:jc w:val="left"/>
             </w:pPr>
             <w:r>
+              <w:t>tasa_actividad_10_mas</w:t>
+            </w:r>
+          </w:p>
+        </w:tc>
+        <w:tc>
+          <w:tcPr>
+            <w:tcBorders>
+              <w:top w:val="single" w:color="CCCCCC" w:sz="1"/>
+              <w:left w:val="single" w:color="CCCCCC" w:sz="1"/>
+              <w:bottom w:val="single" w:color="CCCCCC" w:sz="1"/>
+              <w:right w:val="single" w:color="CCCCCC" w:sz="1"/>
+            </w:tcBorders>
+            <w:shd w:fill="FFFFFF" w:val="clear"/>
+            <w:tcMar>
+              <w:top w:type="dxa" w:w="70"/>
+              <w:left w:type="dxa" w:w="120"/>
+              <w:bottom w:type="dxa" w:w="70"/>
+              <w:right w:type="dxa" w:w="120"/>
+            </w:tcMar>
+          </w:tcPr>
+          <w:p>
+            <w:pPr>
+              <w:jc w:val="both"/>
+            </w:pPr>
+            <w:r>
+              <w:rPr>
+                <w:rFonts w:ascii="Arial" w:cs="Arial" w:eastAsia="Arial" w:hAnsi="Arial"/>
+                <w:b w:val="false"/>
+                <w:bCs w:val="false"/>
+                <w:color w:val="333333"/>
+                <w:sz w:val="18"/>
+                <w:szCs w:val="18"/>
+              </w:rPr>
+              <w:t xml:space="preserve">float</w:t>
+            </w:r>
+          </w:p>
+        </w:tc>
+        <w:tc>
+          <w:tcPr>
+            <w:tcBorders>
+              <w:top w:val="single" w:color="CCCCCC" w:sz="1"/>
+              <w:left w:val="single" w:color="CCCCCC" w:sz="1"/>
+              <w:bottom w:val="single" w:color="CCCCCC" w:sz="1"/>
+              <w:right w:val="single" w:color="CCCCCC" w:sz="1"/>
+            </w:tcBorders>
+            <w:shd w:fill="FFFFFF" w:val="clear"/>
+            <w:tcMar>
+              <w:top w:type="dxa" w:w="70"/>
+              <w:left w:type="dxa" w:w="120"/>
+              <w:bottom w:type="dxa" w:w="70"/>
+              <w:right w:type="dxa" w:w="120"/>
+            </w:tcMar>
+          </w:tcPr>
+          <w:p>
+            <w:pPr>
+              <w:jc w:val="both"/>
+            </w:pPr>
+            <w:r>
+              <w:rPr>
+                <w:rFonts w:ascii="Arial" w:cs="Arial" w:eastAsia="Arial" w:hAnsi="Arial"/>
+                <w:b w:val="false"/>
+                <w:bCs w:val="false"/>
+                <w:color w:val="333333"/>
+                <w:sz w:val="18"/>
+                <w:szCs w:val="18"/>
+              </w:rPr>
+              <w:t xml:space="preserve">PEA / Población ≥10 × 100</w:t>
+            </w:r>
+          </w:p>
+        </w:tc>
+        <w:tc>
+          <w:tcPr>
+            <w:tcBorders>
+              <w:top w:val="single" w:color="CCCCCC" w:sz="1"/>
+              <w:left w:val="single" w:color="CCCCCC" w:sz="1"/>
+              <w:bottom w:val="single" w:color="CCCCCC" w:sz="1"/>
+              <w:right w:val="single" w:color="CCCCCC" w:sz="1"/>
+            </w:tcBorders>
+            <w:shd w:fill="FFFFFF" w:val="clear"/>
+            <w:tcMar>
+              <w:top w:type="dxa" w:w="70"/>
+              <w:left w:type="dxa" w:w="120"/>
+              <w:bottom w:type="dxa" w:w="70"/>
+              <w:right w:type="dxa" w:w="120"/>
+            </w:tcMar>
+          </w:tcPr>
+          <w:p>
+            <w:pPr>
+              <w:jc w:val="both"/>
+            </w:pPr>
+            <w:r>
+              <w:rPr>
+                <w:rFonts w:ascii="Arial" w:cs="Arial" w:eastAsia="Arial" w:hAnsi="Arial"/>
+                <w:b w:val="false"/>
+                <w:bCs w:val="false"/>
+                <w:color w:val="333333"/>
+                <w:sz w:val="18"/>
+                <w:szCs w:val="18"/>
+              </w:rPr>
+              <w:t xml:space="preserve">46.06</w:t>
+            </w:r>
+          </w:p>
+        </w:tc>
+      </w:tr>
+      <w:tr>
+        <w:tc>
+          <w:tcPr>
+            <w:tcBorders>
+              <w:top w:val="single" w:color="CCCCCC" w:sz="1"/>
+              <w:left w:val="single" w:color="CCCCCC" w:sz="1"/>
+              <w:bottom w:val="single" w:color="CCCCCC" w:sz="1"/>
+              <w:right w:val="single" w:color="CCCCCC" w:sz="1"/>
+            </w:tcBorders>
+            <w:shd w:fill="F5F5F5" w:val="clear"/>
+            <w:tcMar>
+              <w:top w:type="dxa" w:w="70"/>
+              <w:left w:type="dxa" w:w="120"/>
+              <w:bottom w:type="dxa" w:w="70"/>
+              <w:right w:type="dxa" w:w="120"/>
+            </w:tcMar>
+          </w:tcPr>
+          <w:p>
+            <w:pPr>
+              <w:jc w:val="left"/>
+            </w:pPr>
+            <w:r>
+              <w:t>tasa_empleo_10_mas</w:t>
+            </w:r>
+          </w:p>
+        </w:tc>
+        <w:tc>
+          <w:tcPr>
+            <w:tcBorders>
+              <w:top w:val="single" w:color="CCCCCC" w:sz="1"/>
+              <w:left w:val="single" w:color="CCCCCC" w:sz="1"/>
+              <w:bottom w:val="single" w:color="CCCCCC" w:sz="1"/>
+              <w:right w:val="single" w:color="CCCCCC" w:sz="1"/>
+            </w:tcBorders>
+            <w:shd w:fill="F5F5F5" w:val="clear"/>
+            <w:tcMar>
+              <w:top w:type="dxa" w:w="70"/>
+              <w:left w:type="dxa" w:w="120"/>
+              <w:bottom w:type="dxa" w:w="70"/>
+              <w:right w:type="dxa" w:w="120"/>
+            </w:tcMar>
+          </w:tcPr>
+          <w:p>
+            <w:pPr>
+              <w:jc w:val="both"/>
+            </w:pPr>
+            <w:r>
+              <w:rPr>
+                <w:rFonts w:ascii="Arial" w:cs="Arial" w:eastAsia="Arial" w:hAnsi="Arial"/>
+                <w:b w:val="false"/>
+                <w:bCs w:val="false"/>
+                <w:color w:val="333333"/>
+                <w:sz w:val="18"/>
+                <w:szCs w:val="18"/>
+              </w:rPr>
+              <w:t xml:space="preserve">float</w:t>
+            </w:r>
+          </w:p>
+        </w:tc>
+        <w:tc>
+          <w:tcPr>
+            <w:tcBorders>
+              <w:top w:val="single" w:color="CCCCCC" w:sz="1"/>
+              <w:left w:val="single" w:color="CCCCCC" w:sz="1"/>
+              <w:bottom w:val="single" w:color="CCCCCC" w:sz="1"/>
+              <w:right w:val="single" w:color="CCCCCC" w:sz="1"/>
+            </w:tcBorders>
+            <w:shd w:fill="F5F5F5" w:val="clear"/>
+            <w:tcMar>
+              <w:top w:type="dxa" w:w="70"/>
+              <w:left w:type="dxa" w:w="120"/>
+              <w:bottom w:type="dxa" w:w="70"/>
+              <w:right w:type="dxa" w:w="120"/>
+            </w:tcMar>
+          </w:tcPr>
+          <w:p>
+            <w:pPr>
+              <w:jc w:val="both"/>
+            </w:pPr>
+            <w:r>
+              <w:rPr>
+                <w:rFonts w:ascii="Arial" w:cs="Arial" w:eastAsia="Arial" w:hAnsi="Arial"/>
+                <w:b w:val="false"/>
+                <w:bCs w:val="false"/>
+                <w:color w:val="333333"/>
+                <w:sz w:val="18"/>
+                <w:szCs w:val="18"/>
+              </w:rPr>
+              <w:t xml:space="preserve">Ocupados / Población ≥10 × 100</w:t>
+            </w:r>
+          </w:p>
+        </w:tc>
+        <w:tc>
+          <w:tcPr>
+            <w:tcBorders>
+              <w:top w:val="single" w:color="CCCCCC" w:sz="1"/>
+              <w:left w:val="single" w:color="CCCCCC" w:sz="1"/>
+              <w:bottom w:val="single" w:color="CCCCCC" w:sz="1"/>
+              <w:right w:val="single" w:color="CCCCCC" w:sz="1"/>
+            </w:tcBorders>
+            <w:shd w:fill="F5F5F5" w:val="clear"/>
+            <w:tcMar>
+              <w:top w:type="dxa" w:w="70"/>
+              <w:left w:type="dxa" w:w="120"/>
+              <w:bottom w:type="dxa" w:w="70"/>
+              <w:right w:type="dxa" w:w="120"/>
+            </w:tcMar>
+          </w:tcPr>
+          <w:p>
+            <w:pPr>
+              <w:jc w:val="both"/>
+            </w:pPr>
+            <w:r>
+              <w:rPr>
+                <w:rFonts w:ascii="Arial" w:cs="Arial" w:eastAsia="Arial" w:hAnsi="Arial"/>
+                <w:b w:val="false"/>
+                <w:bCs w:val="false"/>
+                <w:color w:val="333333"/>
+                <w:sz w:val="18"/>
+                <w:szCs w:val="18"/>
+              </w:rPr>
+              <w:t xml:space="preserve">45.77</w:t>
+            </w:r>
+          </w:p>
+        </w:tc>
+      </w:tr>
+      <w:tr>
+        <w:tc>
+          <w:tcPr>
+            <w:tcBorders>
+              <w:top w:val="single" w:color="CCCCCC" w:sz="1"/>
+              <w:left w:val="single" w:color="CCCCCC" w:sz="1"/>
+              <w:bottom w:val="single" w:color="CCCCCC" w:sz="1"/>
+              <w:right w:val="single" w:color="CCCCCC" w:sz="1"/>
+            </w:tcBorders>
+            <w:shd w:fill="FFFFFF" w:val="clear"/>
+            <w:tcMar>
+              <w:top w:type="dxa" w:w="70"/>
+              <w:left w:type="dxa" w:w="120"/>
+              <w:bottom w:type="dxa" w:w="70"/>
+              <w:right w:type="dxa" w:w="120"/>
+            </w:tcMar>
+          </w:tcPr>
+          <w:p>
+            <w:pPr>
+              <w:jc w:val="left"/>
+            </w:pPr>
+            <w:r>
               <w:rPr>
                 <w:rFonts w:ascii="Courier New" w:cs="Courier New" w:eastAsia="Courier New" w:hAnsi="Courier New"/>
                 <w:b/>
@@ -3518,7 +3762,7 @@
                 <w:sz w:val="17"/>
                 <w:szCs w:val="17"/>
               </w:rPr>
-              <w:t xml:space="preserve">tasa_actividad</w:t>
+              <w:t xml:space="preserve">tasa_desocupacion</w:t>
             </w:r>
           </w:p>
         </w:tc>
@@ -3584,7 +3828,7 @@
                 <w:sz w:val="18"/>
                 <w:szCs w:val="18"/>
               </w:rPr>
-              <w:t xml:space="preserve">PEA / Población ≥10 × 100</w:t>
+              <w:t xml:space="preserve">Desocupados / PEA × 100</w:t>
             </w:r>
           </w:p>
         </w:tc>
@@ -3617,7 +3861,7 @@
                 <w:sz w:val="18"/>
                 <w:szCs w:val="18"/>
               </w:rPr>
-              <w:t xml:space="preserve">46.06</w:t>
+              <w:t xml:space="preserve">0.63</w:t>
             </w:r>
           </w:p>
         </w:tc>
@@ -3632,6 +3876,132 @@
               <w:right w:val="single" w:color="CCCCCC" w:sz="1"/>
             </w:tcBorders>
             <w:shd w:fill="F5F5F5" w:val="clear"/>
+            <w:tcMar>
+              <w:top w:type="dxa" w:w="70"/>
+              <w:left w:type="dxa" w:w="120"/>
+              <w:bottom w:type="dxa" w:w="70"/>
+              <w:right w:type="dxa" w:w="120"/>
+            </w:tcMar>
+          </w:tcPr>
+          <w:p>
+            <w:pPr>
+              <w:jc w:val="left"/>
+            </w:pPr>
+            <w:r>
+              <w:t>tasa_inactividad_10_mas</w:t>
+            </w:r>
+          </w:p>
+        </w:tc>
+        <w:tc>
+          <w:tcPr>
+            <w:tcBorders>
+              <w:top w:val="single" w:color="CCCCCC" w:sz="1"/>
+              <w:left w:val="single" w:color="CCCCCC" w:sz="1"/>
+              <w:bottom w:val="single" w:color="CCCCCC" w:sz="1"/>
+              <w:right w:val="single" w:color="CCCCCC" w:sz="1"/>
+            </w:tcBorders>
+            <w:shd w:fill="F5F5F5" w:val="clear"/>
+            <w:tcMar>
+              <w:top w:type="dxa" w:w="70"/>
+              <w:left w:type="dxa" w:w="120"/>
+              <w:bottom w:type="dxa" w:w="70"/>
+              <w:right w:type="dxa" w:w="120"/>
+            </w:tcMar>
+          </w:tcPr>
+          <w:p>
+            <w:pPr>
+              <w:jc w:val="both"/>
+            </w:pPr>
+            <w:r>
+              <w:rPr>
+                <w:rFonts w:ascii="Arial" w:cs="Arial" w:eastAsia="Arial" w:hAnsi="Arial"/>
+                <w:b w:val="false"/>
+                <w:bCs w:val="false"/>
+                <w:color w:val="333333"/>
+                <w:sz w:val="18"/>
+                <w:szCs w:val="18"/>
+              </w:rPr>
+              <w:t xml:space="preserve">float</w:t>
+            </w:r>
+          </w:p>
+        </w:tc>
+        <w:tc>
+          <w:tcPr>
+            <w:tcBorders>
+              <w:top w:val="single" w:color="CCCCCC" w:sz="1"/>
+              <w:left w:val="single" w:color="CCCCCC" w:sz="1"/>
+              <w:bottom w:val="single" w:color="CCCCCC" w:sz="1"/>
+              <w:right w:val="single" w:color="CCCCCC" w:sz="1"/>
+            </w:tcBorders>
+            <w:shd w:fill="F5F5F5" w:val="clear"/>
+            <w:tcMar>
+              <w:top w:type="dxa" w:w="70"/>
+              <w:left w:type="dxa" w:w="120"/>
+              <w:bottom w:type="dxa" w:w="70"/>
+              <w:right w:type="dxa" w:w="120"/>
+            </w:tcMar>
+          </w:tcPr>
+          <w:p>
+            <w:pPr>
+              <w:jc w:val="both"/>
+            </w:pPr>
+            <w:r>
+              <w:rPr>
+                <w:rFonts w:ascii="Arial" w:cs="Arial" w:eastAsia="Arial" w:hAnsi="Arial"/>
+                <w:b w:val="false"/>
+                <w:bCs w:val="false"/>
+                <w:color w:val="333333"/>
+                <w:sz w:val="18"/>
+                <w:szCs w:val="18"/>
+              </w:rPr>
+              <w:t xml:space="preserve">Inactivos / Población ≥10 × 100</w:t>
+            </w:r>
+          </w:p>
+        </w:tc>
+        <w:tc>
+          <w:tcPr>
+            <w:tcBorders>
+              <w:top w:val="single" w:color="CCCCCC" w:sz="1"/>
+              <w:left w:val="single" w:color="CCCCCC" w:sz="1"/>
+              <w:bottom w:val="single" w:color="CCCCCC" w:sz="1"/>
+              <w:right w:val="single" w:color="CCCCCC" w:sz="1"/>
+            </w:tcBorders>
+            <w:shd w:fill="F5F5F5" w:val="clear"/>
+            <w:tcMar>
+              <w:top w:type="dxa" w:w="70"/>
+              <w:left w:type="dxa" w:w="120"/>
+              <w:bottom w:type="dxa" w:w="70"/>
+              <w:right w:type="dxa" w:w="120"/>
+            </w:tcMar>
+          </w:tcPr>
+          <w:p>
+            <w:pPr>
+              <w:jc w:val="both"/>
+            </w:pPr>
+            <w:r>
+              <w:rPr>
+                <w:rFonts w:ascii="Arial" w:cs="Arial" w:eastAsia="Arial" w:hAnsi="Arial"/>
+                <w:b w:val="false"/>
+                <w:bCs w:val="false"/>
+                <w:color w:val="333333"/>
+                <w:sz w:val="18"/>
+                <w:szCs w:val="18"/>
+              </w:rPr>
+              <w:t xml:space="preserve">53.94</w:t>
+            </w:r>
+          </w:p>
+        </w:tc>
+      </w:tr>
+      <w:tr>
+        <w:tc>
+          <w:tcPr>
+            <w:tcBorders>
+              <w:top w:val="single" w:color="CCCCCC" w:sz="1"/>
+              <w:left w:val="single" w:color="CCCCCC" w:sz="1"/>
+              <w:bottom w:val="single" w:color="CCCCCC" w:sz="1"/>
+              <w:right w:val="single" w:color="CCCCCC" w:sz="1"/>
+            </w:tcBorders>
+            <w:shd w:fill="FFFFFF" w:val="clear"/>
             <w:tcMar>
               <w:top w:type="dxa" w:w="70"/>
               <w:left w:type="dxa" w:w="120"/>
@@ -3652,106 +4022,106 @@
                 <w:sz w:val="17"/>
                 <w:szCs w:val="17"/>
               </w:rPr>
-              <w:t xml:space="preserve">tasa_empleo</w:t>
-            </w:r>
-          </w:p>
-        </w:tc>
-        <w:tc>
-          <w:tcPr>
-            <w:tcBorders>
-              <w:top w:val="single" w:color="CCCCCC" w:sz="1"/>
-              <w:left w:val="single" w:color="CCCCCC" w:sz="1"/>
-              <w:bottom w:val="single" w:color="CCCCCC" w:sz="1"/>
-              <w:right w:val="single" w:color="CCCCCC" w:sz="1"/>
-            </w:tcBorders>
-            <w:shd w:fill="F5F5F5" w:val="clear"/>
-            <w:tcMar>
-              <w:top w:type="dxa" w:w="70"/>
-              <w:left w:type="dxa" w:w="120"/>
-              <w:bottom w:type="dxa" w:w="70"/>
-              <w:right w:type="dxa" w:w="120"/>
-            </w:tcMar>
-          </w:tcPr>
-          <w:p>
-            <w:pPr>
-              <w:jc w:val="both"/>
-            </w:pPr>
-            <w:r>
-              <w:rPr>
-                <w:rFonts w:ascii="Arial" w:cs="Arial" w:eastAsia="Arial" w:hAnsi="Arial"/>
-                <w:b w:val="false"/>
-                <w:bCs w:val="false"/>
-                <w:color w:val="333333"/>
-                <w:sz w:val="18"/>
-                <w:szCs w:val="18"/>
-              </w:rPr>
-              <w:t xml:space="preserve">float</w:t>
-            </w:r>
-          </w:p>
-        </w:tc>
-        <w:tc>
-          <w:tcPr>
-            <w:tcBorders>
-              <w:top w:val="single" w:color="CCCCCC" w:sz="1"/>
-              <w:left w:val="single" w:color="CCCCCC" w:sz="1"/>
-              <w:bottom w:val="single" w:color="CCCCCC" w:sz="1"/>
-              <w:right w:val="single" w:color="CCCCCC" w:sz="1"/>
-            </w:tcBorders>
-            <w:shd w:fill="F5F5F5" w:val="clear"/>
-            <w:tcMar>
-              <w:top w:type="dxa" w:w="70"/>
-              <w:left w:type="dxa" w:w="120"/>
-              <w:bottom w:type="dxa" w:w="70"/>
-              <w:right w:type="dxa" w:w="120"/>
-            </w:tcMar>
-          </w:tcPr>
-          <w:p>
-            <w:pPr>
-              <w:jc w:val="both"/>
-            </w:pPr>
-            <w:r>
-              <w:rPr>
-                <w:rFonts w:ascii="Arial" w:cs="Arial" w:eastAsia="Arial" w:hAnsi="Arial"/>
-                <w:b w:val="false"/>
-                <w:bCs w:val="false"/>
-                <w:color w:val="333333"/>
-                <w:sz w:val="18"/>
-                <w:szCs w:val="18"/>
-              </w:rPr>
-              <w:t xml:space="preserve">Ocupados / Población ≥10 × 100</w:t>
-            </w:r>
-          </w:p>
-        </w:tc>
-        <w:tc>
-          <w:tcPr>
-            <w:tcBorders>
-              <w:top w:val="single" w:color="CCCCCC" w:sz="1"/>
-              <w:left w:val="single" w:color="CCCCCC" w:sz="1"/>
-              <w:bottom w:val="single" w:color="CCCCCC" w:sz="1"/>
-              <w:right w:val="single" w:color="CCCCCC" w:sz="1"/>
-            </w:tcBorders>
-            <w:shd w:fill="F5F5F5" w:val="clear"/>
-            <w:tcMar>
-              <w:top w:type="dxa" w:w="70"/>
-              <w:left w:type="dxa" w:w="120"/>
-              <w:bottom w:type="dxa" w:w="70"/>
-              <w:right w:type="dxa" w:w="120"/>
-            </w:tcMar>
-          </w:tcPr>
-          <w:p>
-            <w:pPr>
-              <w:jc w:val="both"/>
-            </w:pPr>
-            <w:r>
-              <w:rPr>
-                <w:rFonts w:ascii="Arial" w:cs="Arial" w:eastAsia="Arial" w:hAnsi="Arial"/>
-                <w:b w:val="false"/>
-                <w:bCs w:val="false"/>
-                <w:color w:val="333333"/>
-                <w:sz w:val="18"/>
-                <w:szCs w:val="18"/>
-              </w:rPr>
-              <w:t xml:space="preserve">45.77</w:t>
+              <w:t xml:space="preserve">tasa_informalidad</w:t>
+            </w:r>
+          </w:p>
+        </w:tc>
+        <w:tc>
+          <w:tcPr>
+            <w:tcBorders>
+              <w:top w:val="single" w:color="CCCCCC" w:sz="1"/>
+              <w:left w:val="single" w:color="CCCCCC" w:sz="1"/>
+              <w:bottom w:val="single" w:color="CCCCCC" w:sz="1"/>
+              <w:right w:val="single" w:color="CCCCCC" w:sz="1"/>
+            </w:tcBorders>
+            <w:shd w:fill="FFFFFF" w:val="clear"/>
+            <w:tcMar>
+              <w:top w:type="dxa" w:w="70"/>
+              <w:left w:type="dxa" w:w="120"/>
+              <w:bottom w:type="dxa" w:w="70"/>
+              <w:right w:type="dxa" w:w="120"/>
+            </w:tcMar>
+          </w:tcPr>
+          <w:p>
+            <w:pPr>
+              <w:jc w:val="both"/>
+            </w:pPr>
+            <w:r>
+              <w:rPr>
+                <w:rFonts w:ascii="Arial" w:cs="Arial" w:eastAsia="Arial" w:hAnsi="Arial"/>
+                <w:b w:val="false"/>
+                <w:bCs w:val="false"/>
+                <w:color w:val="333333"/>
+                <w:sz w:val="18"/>
+                <w:szCs w:val="18"/>
+              </w:rPr>
+              <w:t xml:space="preserve">float / null</w:t>
+            </w:r>
+          </w:p>
+        </w:tc>
+        <w:tc>
+          <w:tcPr>
+            <w:tcBorders>
+              <w:top w:val="single" w:color="CCCCCC" w:sz="1"/>
+              <w:left w:val="single" w:color="CCCCCC" w:sz="1"/>
+              <w:bottom w:val="single" w:color="CCCCCC" w:sz="1"/>
+              <w:right w:val="single" w:color="CCCCCC" w:sz="1"/>
+            </w:tcBorders>
+            <w:shd w:fill="FFFFFF" w:val="clear"/>
+            <w:tcMar>
+              <w:top w:type="dxa" w:w="70"/>
+              <w:left w:type="dxa" w:w="120"/>
+              <w:bottom w:type="dxa" w:w="70"/>
+              <w:right w:type="dxa" w:w="120"/>
+            </w:tcMar>
+          </w:tcPr>
+          <w:p>
+            <w:pPr>
+              <w:jc w:val="both"/>
+            </w:pPr>
+            <w:r>
+              <w:rPr>
+                <w:rFonts w:ascii="Arial" w:cs="Arial" w:eastAsia="Arial" w:hAnsi="Arial"/>
+                <w:b w:val="false"/>
+                <w:bCs w:val="false"/>
+                <w:color w:val="333333"/>
+                <w:sz w:val="18"/>
+                <w:szCs w:val="18"/>
+              </w:rPr>
+              <w:t xml:space="preserve">Ocupados EMPLEO=2 / Ocupados EMPLEO válido × 100</w:t>
+            </w:r>
+          </w:p>
+        </w:tc>
+        <w:tc>
+          <w:tcPr>
+            <w:tcBorders>
+              <w:top w:val="single" w:color="CCCCCC" w:sz="1"/>
+              <w:left w:val="single" w:color="CCCCCC" w:sz="1"/>
+              <w:bottom w:val="single" w:color="CCCCCC" w:sz="1"/>
+              <w:right w:val="single" w:color="CCCCCC" w:sz="1"/>
+            </w:tcBorders>
+            <w:shd w:fill="FFFFFF" w:val="clear"/>
+            <w:tcMar>
+              <w:top w:type="dxa" w:w="70"/>
+              <w:left w:type="dxa" w:w="120"/>
+              <w:bottom w:type="dxa" w:w="70"/>
+              <w:right w:type="dxa" w:w="120"/>
+            </w:tcMar>
+          </w:tcPr>
+          <w:p>
+            <w:pPr>
+              <w:jc w:val="both"/>
+            </w:pPr>
+            <w:r>
+              <w:rPr>
+                <w:rFonts w:ascii="Arial" w:cs="Arial" w:eastAsia="Arial" w:hAnsi="Arial"/>
+                <w:b w:val="false"/>
+                <w:bCs w:val="false"/>
+                <w:color w:val="333333"/>
+                <w:sz w:val="18"/>
+                <w:szCs w:val="18"/>
+              </w:rPr>
+              <w:t xml:space="preserve">55.21</w:t>
             </w:r>
           </w:p>
         </w:tc>
@@ -3759,133 +4129,41 @@
       <w:tr>
         <w:tc>
           <w:tcPr>
-            <w:tcBorders>
-              <w:top w:val="single" w:color="CCCCCC" w:sz="1"/>
-              <w:left w:val="single" w:color="CCCCCC" w:sz="1"/>
-              <w:bottom w:val="single" w:color="CCCCCC" w:sz="1"/>
-              <w:right w:val="single" w:color="CCCCCC" w:sz="1"/>
-            </w:tcBorders>
-            <w:shd w:fill="FFFFFF" w:val="clear"/>
-            <w:tcMar>
-              <w:top w:type="dxa" w:w="70"/>
-              <w:left w:type="dxa" w:w="120"/>
-              <w:bottom w:type="dxa" w:w="70"/>
-              <w:right w:type="dxa" w:w="120"/>
-            </w:tcMar>
-          </w:tcPr>
-          <w:p>
-            <w:pPr>
-              <w:jc w:val="left"/>
-            </w:pPr>
-            <w:r>
-              <w:rPr>
-                <w:rFonts w:ascii="Courier New" w:cs="Courier New" w:eastAsia="Courier New" w:hAnsi="Courier New"/>
-                <w:b/>
-                <w:bCs/>
-                <w:color w:val="1F3A6E"/>
-                <w:sz w:val="17"/>
-                <w:szCs w:val="17"/>
-              </w:rPr>
-              <w:t xml:space="preserve">tasa_desocupacion</w:t>
-            </w:r>
-          </w:p>
-        </w:tc>
-        <w:tc>
-          <w:tcPr>
-            <w:tcBorders>
-              <w:top w:val="single" w:color="CCCCCC" w:sz="1"/>
-              <w:left w:val="single" w:color="CCCCCC" w:sz="1"/>
-              <w:bottom w:val="single" w:color="CCCCCC" w:sz="1"/>
-              <w:right w:val="single" w:color="CCCCCC" w:sz="1"/>
-            </w:tcBorders>
-            <w:shd w:fill="FFFFFF" w:val="clear"/>
-            <w:tcMar>
-              <w:top w:type="dxa" w:w="70"/>
-              <w:left w:type="dxa" w:w="120"/>
-              <w:bottom w:type="dxa" w:w="70"/>
-              <w:right w:type="dxa" w:w="120"/>
-            </w:tcMar>
-          </w:tcPr>
-          <w:p>
-            <w:pPr>
-              <w:jc w:val="both"/>
-            </w:pPr>
-            <w:r>
-              <w:rPr>
-                <w:rFonts w:ascii="Arial" w:cs="Arial" w:eastAsia="Arial" w:hAnsi="Arial"/>
-                <w:b w:val="false"/>
-                <w:bCs w:val="false"/>
-                <w:color w:val="333333"/>
-                <w:sz w:val="18"/>
-                <w:szCs w:val="18"/>
-              </w:rPr>
-              <w:t xml:space="preserve">float</w:t>
-            </w:r>
-          </w:p>
-        </w:tc>
-        <w:tc>
-          <w:tcPr>
-            <w:tcBorders>
-              <w:top w:val="single" w:color="CCCCCC" w:sz="1"/>
-              <w:left w:val="single" w:color="CCCCCC" w:sz="1"/>
-              <w:bottom w:val="single" w:color="CCCCCC" w:sz="1"/>
-              <w:right w:val="single" w:color="CCCCCC" w:sz="1"/>
-            </w:tcBorders>
-            <w:shd w:fill="FFFFFF" w:val="clear"/>
-            <w:tcMar>
-              <w:top w:type="dxa" w:w="70"/>
-              <w:left w:type="dxa" w:w="120"/>
-              <w:bottom w:type="dxa" w:w="70"/>
-              <w:right w:type="dxa" w:w="120"/>
-            </w:tcMar>
-          </w:tcPr>
-          <w:p>
-            <w:pPr>
-              <w:jc w:val="both"/>
-            </w:pPr>
-            <w:r>
-              <w:rPr>
-                <w:rFonts w:ascii="Arial" w:cs="Arial" w:eastAsia="Arial" w:hAnsi="Arial"/>
-                <w:b w:val="false"/>
-                <w:bCs w:val="false"/>
-                <w:color w:val="333333"/>
-                <w:sz w:val="18"/>
-                <w:szCs w:val="18"/>
-              </w:rPr>
-              <w:t xml:space="preserve">Desocupados / PEA × 100</w:t>
-            </w:r>
-          </w:p>
-        </w:tc>
-        <w:tc>
-          <w:tcPr>
-            <w:tcBorders>
-              <w:top w:val="single" w:color="CCCCCC" w:sz="1"/>
-              <w:left w:val="single" w:color="CCCCCC" w:sz="1"/>
-              <w:bottom w:val="single" w:color="CCCCCC" w:sz="1"/>
-              <w:right w:val="single" w:color="CCCCCC" w:sz="1"/>
-            </w:tcBorders>
-            <w:shd w:fill="FFFFFF" w:val="clear"/>
-            <w:tcMar>
-              <w:top w:type="dxa" w:w="70"/>
-              <w:left w:type="dxa" w:w="120"/>
-              <w:bottom w:type="dxa" w:w="70"/>
-              <w:right w:type="dxa" w:w="120"/>
-            </w:tcMar>
-          </w:tcPr>
-          <w:p>
-            <w:pPr>
-              <w:jc w:val="both"/>
-            </w:pPr>
-            <w:r>
-              <w:rPr>
-                <w:rFonts w:ascii="Arial" w:cs="Arial" w:eastAsia="Arial" w:hAnsi="Arial"/>
-                <w:b w:val="false"/>
-                <w:bCs w:val="false"/>
-                <w:color w:val="333333"/>
-                <w:sz w:val="18"/>
-                <w:szCs w:val="18"/>
-              </w:rPr>
-              <w:t xml:space="preserve">0.63</w:t>
+            <w:tcW w:type="dxa" w:w="2200"/>
+          </w:tcPr>
+          <w:p>
+            <w:r>
+              <w:t>tasa_actividad_oficial</w:t>
+            </w:r>
+          </w:p>
+        </w:tc>
+        <w:tc>
+          <w:tcPr>
+            <w:tcW w:type="dxa" w:w="800"/>
+          </w:tcPr>
+          <w:p>
+            <w:r>
+              <w:t>float</w:t>
+            </w:r>
+          </w:p>
+        </w:tc>
+        <w:tc>
+          <w:tcPr>
+            <w:tcW w:type="dxa" w:w="4626"/>
+          </w:tcPr>
+          <w:p>
+            <w:r>
+              <w:t>PEA / Población total × 100</w:t>
+            </w:r>
+          </w:p>
+        </w:tc>
+        <w:tc>
+          <w:tcPr>
+            <w:tcW w:type="dxa" w:w="1400"/>
+          </w:tcPr>
+          <w:p>
+            <w:r>
+              <w:t>41.23</w:t>
             </w:r>
           </w:p>
         </w:tc>
@@ -3893,133 +4171,41 @@
       <w:tr>
         <w:tc>
           <w:tcPr>
-            <w:tcBorders>
-              <w:top w:val="single" w:color="CCCCCC" w:sz="1"/>
-              <w:left w:val="single" w:color="CCCCCC" w:sz="1"/>
-              <w:bottom w:val="single" w:color="CCCCCC" w:sz="1"/>
-              <w:right w:val="single" w:color="CCCCCC" w:sz="1"/>
-            </w:tcBorders>
-            <w:shd w:fill="F5F5F5" w:val="clear"/>
-            <w:tcMar>
-              <w:top w:type="dxa" w:w="70"/>
-              <w:left w:type="dxa" w:w="120"/>
-              <w:bottom w:type="dxa" w:w="70"/>
-              <w:right w:type="dxa" w:w="120"/>
-            </w:tcMar>
-          </w:tcPr>
-          <w:p>
-            <w:pPr>
-              <w:jc w:val="left"/>
-            </w:pPr>
-            <w:r>
-              <w:rPr>
-                <w:rFonts w:ascii="Courier New" w:cs="Courier New" w:eastAsia="Courier New" w:hAnsi="Courier New"/>
-                <w:b/>
-                <w:bCs/>
-                <w:color w:val="1F3A6E"/>
-                <w:sz w:val="17"/>
-                <w:szCs w:val="17"/>
-              </w:rPr>
-              <w:t xml:space="preserve">tasa_inactividad</w:t>
-            </w:r>
-          </w:p>
-        </w:tc>
-        <w:tc>
-          <w:tcPr>
-            <w:tcBorders>
-              <w:top w:val="single" w:color="CCCCCC" w:sz="1"/>
-              <w:left w:val="single" w:color="CCCCCC" w:sz="1"/>
-              <w:bottom w:val="single" w:color="CCCCCC" w:sz="1"/>
-              <w:right w:val="single" w:color="CCCCCC" w:sz="1"/>
-            </w:tcBorders>
-            <w:shd w:fill="F5F5F5" w:val="clear"/>
-            <w:tcMar>
-              <w:top w:type="dxa" w:w="70"/>
-              <w:left w:type="dxa" w:w="120"/>
-              <w:bottom w:type="dxa" w:w="70"/>
-              <w:right w:type="dxa" w:w="120"/>
-            </w:tcMar>
-          </w:tcPr>
-          <w:p>
-            <w:pPr>
-              <w:jc w:val="both"/>
-            </w:pPr>
-            <w:r>
-              <w:rPr>
-                <w:rFonts w:ascii="Arial" w:cs="Arial" w:eastAsia="Arial" w:hAnsi="Arial"/>
-                <w:b w:val="false"/>
-                <w:bCs w:val="false"/>
-                <w:color w:val="333333"/>
-                <w:sz w:val="18"/>
-                <w:szCs w:val="18"/>
-              </w:rPr>
-              <w:t xml:space="preserve">float</w:t>
-            </w:r>
-          </w:p>
-        </w:tc>
-        <w:tc>
-          <w:tcPr>
-            <w:tcBorders>
-              <w:top w:val="single" w:color="CCCCCC" w:sz="1"/>
-              <w:left w:val="single" w:color="CCCCCC" w:sz="1"/>
-              <w:bottom w:val="single" w:color="CCCCCC" w:sz="1"/>
-              <w:right w:val="single" w:color="CCCCCC" w:sz="1"/>
-            </w:tcBorders>
-            <w:shd w:fill="F5F5F5" w:val="clear"/>
-            <w:tcMar>
-              <w:top w:type="dxa" w:w="70"/>
-              <w:left w:type="dxa" w:w="120"/>
-              <w:bottom w:type="dxa" w:w="70"/>
-              <w:right w:type="dxa" w:w="120"/>
-            </w:tcMar>
-          </w:tcPr>
-          <w:p>
-            <w:pPr>
-              <w:jc w:val="both"/>
-            </w:pPr>
-            <w:r>
-              <w:rPr>
-                <w:rFonts w:ascii="Arial" w:cs="Arial" w:eastAsia="Arial" w:hAnsi="Arial"/>
-                <w:b w:val="false"/>
-                <w:bCs w:val="false"/>
-                <w:color w:val="333333"/>
-                <w:sz w:val="18"/>
-                <w:szCs w:val="18"/>
-              </w:rPr>
-              <w:t xml:space="preserve">Inactivos / Población ≥10 × 100</w:t>
-            </w:r>
-          </w:p>
-        </w:tc>
-        <w:tc>
-          <w:tcPr>
-            <w:tcBorders>
-              <w:top w:val="single" w:color="CCCCCC" w:sz="1"/>
-              <w:left w:val="single" w:color="CCCCCC" w:sz="1"/>
-              <w:bottom w:val="single" w:color="CCCCCC" w:sz="1"/>
-              <w:right w:val="single" w:color="CCCCCC" w:sz="1"/>
-            </w:tcBorders>
-            <w:shd w:fill="F5F5F5" w:val="clear"/>
-            <w:tcMar>
-              <w:top w:type="dxa" w:w="70"/>
-              <w:left w:type="dxa" w:w="120"/>
-              <w:bottom w:type="dxa" w:w="70"/>
-              <w:right w:type="dxa" w:w="120"/>
-            </w:tcMar>
-          </w:tcPr>
-          <w:p>
-            <w:pPr>
-              <w:jc w:val="both"/>
-            </w:pPr>
-            <w:r>
-              <w:rPr>
-                <w:rFonts w:ascii="Arial" w:cs="Arial" w:eastAsia="Arial" w:hAnsi="Arial"/>
-                <w:b w:val="false"/>
-                <w:bCs w:val="false"/>
-                <w:color w:val="333333"/>
-                <w:sz w:val="18"/>
-                <w:szCs w:val="18"/>
-              </w:rPr>
-              <w:t xml:space="preserve">53.94</w:t>
+            <w:tcW w:type="dxa" w:w="2200"/>
+          </w:tcPr>
+          <w:p>
+            <w:r>
+              <w:t>tasa_empleo_oficial</w:t>
+            </w:r>
+          </w:p>
+        </w:tc>
+        <w:tc>
+          <w:tcPr>
+            <w:tcW w:type="dxa" w:w="800"/>
+          </w:tcPr>
+          <w:p>
+            <w:r>
+              <w:t>float</w:t>
+            </w:r>
+          </w:p>
+        </w:tc>
+        <w:tc>
+          <w:tcPr>
+            <w:tcW w:type="dxa" w:w="4626"/>
+          </w:tcPr>
+          <w:p>
+            <w:r>
+              <w:t>Ocupados / Población total × 100</w:t>
+            </w:r>
+          </w:p>
+        </w:tc>
+        <w:tc>
+          <w:tcPr>
+            <w:tcW w:type="dxa" w:w="1400"/>
+          </w:tcPr>
+          <w:p>
+            <w:r>
+              <w:t>40.97</w:t>
             </w:r>
           </w:p>
         </w:tc>
@@ -4027,133 +4213,41 @@
       <w:tr>
         <w:tc>
           <w:tcPr>
-            <w:tcBorders>
-              <w:top w:val="single" w:color="CCCCCC" w:sz="1"/>
-              <w:left w:val="single" w:color="CCCCCC" w:sz="1"/>
-              <w:bottom w:val="single" w:color="CCCCCC" w:sz="1"/>
-              <w:right w:val="single" w:color="CCCCCC" w:sz="1"/>
-            </w:tcBorders>
-            <w:shd w:fill="FFFFFF" w:val="clear"/>
-            <w:tcMar>
-              <w:top w:type="dxa" w:w="70"/>
-              <w:left w:type="dxa" w:w="120"/>
-              <w:bottom w:type="dxa" w:w="70"/>
-              <w:right w:type="dxa" w:w="120"/>
-            </w:tcMar>
-          </w:tcPr>
-          <w:p>
-            <w:pPr>
-              <w:jc w:val="left"/>
-            </w:pPr>
-            <w:r>
-              <w:rPr>
-                <w:rFonts w:ascii="Courier New" w:cs="Courier New" w:eastAsia="Courier New" w:hAnsi="Courier New"/>
-                <w:b/>
-                <w:bCs/>
-                <w:color w:val="1F3A6E"/>
-                <w:sz w:val="17"/>
-                <w:szCs w:val="17"/>
-              </w:rPr>
-              <w:t xml:space="preserve">tasa_informalidad</w:t>
-            </w:r>
-          </w:p>
-        </w:tc>
-        <w:tc>
-          <w:tcPr>
-            <w:tcBorders>
-              <w:top w:val="single" w:color="CCCCCC" w:sz="1"/>
-              <w:left w:val="single" w:color="CCCCCC" w:sz="1"/>
-              <w:bottom w:val="single" w:color="CCCCCC" w:sz="1"/>
-              <w:right w:val="single" w:color="CCCCCC" w:sz="1"/>
-            </w:tcBorders>
-            <w:shd w:fill="FFFFFF" w:val="clear"/>
-            <w:tcMar>
-              <w:top w:type="dxa" w:w="70"/>
-              <w:left w:type="dxa" w:w="120"/>
-              <w:bottom w:type="dxa" w:w="70"/>
-              <w:right w:type="dxa" w:w="120"/>
-            </w:tcMar>
-          </w:tcPr>
-          <w:p>
-            <w:pPr>
-              <w:jc w:val="both"/>
-            </w:pPr>
-            <w:r>
-              <w:rPr>
-                <w:rFonts w:ascii="Arial" w:cs="Arial" w:eastAsia="Arial" w:hAnsi="Arial"/>
-                <w:b w:val="false"/>
-                <w:bCs w:val="false"/>
-                <w:color w:val="333333"/>
-                <w:sz w:val="18"/>
-                <w:szCs w:val="18"/>
-              </w:rPr>
-              <w:t xml:space="preserve">float / null</w:t>
-            </w:r>
-          </w:p>
-        </w:tc>
-        <w:tc>
-          <w:tcPr>
-            <w:tcBorders>
-              <w:top w:val="single" w:color="CCCCCC" w:sz="1"/>
-              <w:left w:val="single" w:color="CCCCCC" w:sz="1"/>
-              <w:bottom w:val="single" w:color="CCCCCC" w:sz="1"/>
-              <w:right w:val="single" w:color="CCCCCC" w:sz="1"/>
-            </w:tcBorders>
-            <w:shd w:fill="FFFFFF" w:val="clear"/>
-            <w:tcMar>
-              <w:top w:type="dxa" w:w="70"/>
-              <w:left w:type="dxa" w:w="120"/>
-              <w:bottom w:type="dxa" w:w="70"/>
-              <w:right w:type="dxa" w:w="120"/>
-            </w:tcMar>
-          </w:tcPr>
-          <w:p>
-            <w:pPr>
-              <w:jc w:val="both"/>
-            </w:pPr>
-            <w:r>
-              <w:rPr>
-                <w:rFonts w:ascii="Arial" w:cs="Arial" w:eastAsia="Arial" w:hAnsi="Arial"/>
-                <w:b w:val="false"/>
-                <w:bCs w:val="false"/>
-                <w:color w:val="333333"/>
-                <w:sz w:val="18"/>
-                <w:szCs w:val="18"/>
-              </w:rPr>
-              <w:t xml:space="preserve">Ocupados EMPLEO=2 / Ocupados EMPLEO válido × 100</w:t>
-            </w:r>
-          </w:p>
-        </w:tc>
-        <w:tc>
-          <w:tcPr>
-            <w:tcBorders>
-              <w:top w:val="single" w:color="CCCCCC" w:sz="1"/>
-              <w:left w:val="single" w:color="CCCCCC" w:sz="1"/>
-              <w:bottom w:val="single" w:color="CCCCCC" w:sz="1"/>
-              <w:right w:val="single" w:color="CCCCCC" w:sz="1"/>
-            </w:tcBorders>
-            <w:shd w:fill="FFFFFF" w:val="clear"/>
-            <w:tcMar>
-              <w:top w:type="dxa" w:w="70"/>
-              <w:left w:type="dxa" w:w="120"/>
-              <w:bottom w:type="dxa" w:w="70"/>
-              <w:right w:type="dxa" w:w="120"/>
-            </w:tcMar>
-          </w:tcPr>
-          <w:p>
-            <w:pPr>
-              <w:jc w:val="both"/>
-            </w:pPr>
-            <w:r>
-              <w:rPr>
-                <w:rFonts w:ascii="Arial" w:cs="Arial" w:eastAsia="Arial" w:hAnsi="Arial"/>
-                <w:b w:val="false"/>
-                <w:bCs w:val="false"/>
-                <w:color w:val="333333"/>
-                <w:sz w:val="18"/>
-                <w:szCs w:val="18"/>
-              </w:rPr>
-              <w:t xml:space="preserve">55.21</w:t>
+            <w:tcW w:type="dxa" w:w="2200"/>
+          </w:tcPr>
+          <w:p>
+            <w:r>
+              <w:t>proporcion_inactiva_total</w:t>
+            </w:r>
+          </w:p>
+        </w:tc>
+        <w:tc>
+          <w:tcPr>
+            <w:tcW w:type="dxa" w:w="800"/>
+          </w:tcPr>
+          <w:p>
+            <w:r>
+              <w:t>float</w:t>
+            </w:r>
+          </w:p>
+        </w:tc>
+        <w:tc>
+          <w:tcPr>
+            <w:tcW w:type="dxa" w:w="4626"/>
+          </w:tcPr>
+          <w:p>
+            <w:r>
+              <w:t>100 - tasa de actividad oficial</w:t>
+            </w:r>
+          </w:p>
+        </w:tc>
+        <w:tc>
+          <w:tcPr>
+            <w:tcW w:type="dxa" w:w="1400"/>
+          </w:tcPr>
+          <w:p>
+            <w:r>
+              <w:t>58.77</w:t>
             </w:r>
           </w:p>
         </w:tc>
@@ -8078,6 +8172,66 @@
               <w:jc w:val="left"/>
             </w:pPr>
             <w:r>
+              <w:t>Reportes institucionales</w:t>
+            </w:r>
+          </w:p>
+        </w:tc>
+        <w:tc>
+          <w:tcPr>
+            <w:tcBorders>
+              <w:top w:val="single" w:color="CCCCCC" w:sz="1"/>
+              <w:left w:val="single" w:color="CCCCCC" w:sz="1"/>
+              <w:bottom w:val="single" w:color="CCCCCC" w:sz="1"/>
+              <w:right w:val="single" w:color="CCCCCC" w:sz="1"/>
+            </w:tcBorders>
+            <w:shd w:fill="FFFFFF" w:val="clear"/>
+            <w:tcMar>
+              <w:top w:type="dxa" w:w="70"/>
+              <w:left w:type="dxa" w:w="120"/>
+              <w:bottom w:type="dxa" w:w="70"/>
+              <w:right w:type="dxa" w:w="120"/>
+            </w:tcMar>
+          </w:tcPr>
+          <w:p>
+            <w:pPr>
+              <w:jc w:val="both"/>
+            </w:pPr>
+            <w:r>
+              <w:rPr>
+                <w:rFonts w:ascii="Arial" w:cs="Arial" w:eastAsia="Arial" w:hAnsi="Arial"/>
+                <w:b w:val="false"/>
+                <w:bCs w:val="false"/>
+                <w:color w:val="333333"/>
+                <w:sz w:val="18"/>
+                <w:szCs w:val="18"/>
+              </w:rPr>
+              <w:t xml:space="preserve">historico_SDE.csv — abre directo en Excel o cualquier herramienta de visualización</w:t>
+            </w:r>
+          </w:p>
+        </w:tc>
+      </w:tr>
+      <w:tr>
+        <w:tc>
+          <w:tcPr>
+            <w:tcBorders>
+              <w:top w:val="single" w:color="CCCCCC" w:sz="1"/>
+              <w:left w:val="single" w:color="CCCCCC" w:sz="1"/>
+              <w:bottom w:val="single" w:color="CCCCCC" w:sz="1"/>
+              <w:right w:val="single" w:color="CCCCCC" w:sz="1"/>
+            </w:tcBorders>
+            <w:shd w:fill="F5F5F5" w:val="clear"/>
+            <w:tcMar>
+              <w:top w:type="dxa" w:w="70"/>
+              <w:left w:type="dxa" w:w="120"/>
+              <w:bottom w:type="dxa" w:w="70"/>
+              <w:right w:type="dxa" w:w="120"/>
+            </w:tcMar>
+          </w:tcPr>
+          <w:p>
+            <w:pPr>
+              <w:jc w:val="left"/>
+            </w:pPr>
+            <w:r>
               <w:rPr>
                 <w:rFonts w:ascii="Courier New" w:cs="Courier New" w:eastAsia="Courier New" w:hAnsi="Courier New"/>
                 <w:b/>
@@ -8086,40 +8240,40 @@
                 <w:sz w:val="17"/>
                 <w:szCs w:val="17"/>
               </w:rPr>
-              <w:t xml:space="preserve">Reportes oficiales</w:t>
-            </w:r>
-          </w:p>
-        </w:tc>
-        <w:tc>
-          <w:tcPr>
-            <w:tcBorders>
-              <w:top w:val="single" w:color="CCCCCC" w:sz="1"/>
-              <w:left w:val="single" w:color="CCCCCC" w:sz="1"/>
-              <w:bottom w:val="single" w:color="CCCCCC" w:sz="1"/>
-              <w:right w:val="single" w:color="CCCCCC" w:sz="1"/>
-            </w:tcBorders>
-            <w:shd w:fill="FFFFFF" w:val="clear"/>
-            <w:tcMar>
-              <w:top w:type="dxa" w:w="70"/>
-              <w:left w:type="dxa" w:w="120"/>
-              <w:bottom w:type="dxa" w:w="70"/>
-              <w:right w:type="dxa" w:w="120"/>
-            </w:tcMar>
-          </w:tcPr>
-          <w:p>
-            <w:pPr>
-              <w:jc w:val="both"/>
-            </w:pPr>
-            <w:r>
-              <w:rPr>
-                <w:rFonts w:ascii="Arial" w:cs="Arial" w:eastAsia="Arial" w:hAnsi="Arial"/>
-                <w:b w:val="false"/>
-                <w:bCs w:val="false"/>
-                <w:color w:val="333333"/>
-                <w:sz w:val="18"/>
-                <w:szCs w:val="18"/>
-              </w:rPr>
-              <w:t xml:space="preserve">historico_SDE.csv — abre directo en Excel o cualquier herramienta de visualización</w:t>
+              <w:t xml:space="preserve">Auditoría</w:t>
+            </w:r>
+          </w:p>
+        </w:tc>
+        <w:tc>
+          <w:tcPr>
+            <w:tcBorders>
+              <w:top w:val="single" w:color="CCCCCC" w:sz="1"/>
+              <w:left w:val="single" w:color="CCCCCC" w:sz="1"/>
+              <w:bottom w:val="single" w:color="CCCCCC" w:sz="1"/>
+              <w:right w:val="single" w:color="CCCCCC" w:sz="1"/>
+            </w:tcBorders>
+            <w:shd w:fill="F5F5F5" w:val="clear"/>
+            <w:tcMar>
+              <w:top w:type="dxa" w:w="70"/>
+              <w:left w:type="dxa" w:w="120"/>
+              <w:bottom w:type="dxa" w:w="70"/>
+              <w:right w:type="dxa" w:w="120"/>
+            </w:tcMar>
+          </w:tcPr>
+          <w:p>
+            <w:pPr>
+              <w:jc w:val="both"/>
+            </w:pPr>
+            <w:r>
+              <w:rPr>
+                <w:rFonts w:ascii="Arial" w:cs="Arial" w:eastAsia="Arial" w:hAnsi="Arial"/>
+                <w:b w:val="false"/>
+                <w:bCs w:val="false"/>
+                <w:color w:val="333333"/>
+                <w:sz w:val="18"/>
+                <w:szCs w:val="18"/>
+              </w:rPr>
+              <w:t xml:space="preserve">Cruzar calidad_datos_SDE_&lt;periodo&gt;.csv con el histórico</w:t>
             </w:r>
           </w:p>
         </w:tc>
@@ -8133,7 +8287,7 @@
               <w:bottom w:val="single" w:color="CCCCCC" w:sz="1"/>
               <w:right w:val="single" w:color="CCCCCC" w:sz="1"/>
             </w:tcBorders>
-            <w:shd w:fill="F5F5F5" w:val="clear"/>
+            <w:shd w:fill="FFFFFF" w:val="clear"/>
             <w:tcMar>
               <w:top w:type="dxa" w:w="70"/>
               <w:left w:type="dxa" w:w="120"/>
@@ -8154,40 +8308,40 @@
                 <w:sz w:val="17"/>
                 <w:szCs w:val="17"/>
               </w:rPr>
-              <w:t xml:space="preserve">Auditoría</w:t>
-            </w:r>
-          </w:p>
-        </w:tc>
-        <w:tc>
-          <w:tcPr>
-            <w:tcBorders>
-              <w:top w:val="single" w:color="CCCCCC" w:sz="1"/>
-              <w:left w:val="single" w:color="CCCCCC" w:sz="1"/>
-              <w:bottom w:val="single" w:color="CCCCCC" w:sz="1"/>
-              <w:right w:val="single" w:color="CCCCCC" w:sz="1"/>
-            </w:tcBorders>
-            <w:shd w:fill="F5F5F5" w:val="clear"/>
-            <w:tcMar>
-              <w:top w:type="dxa" w:w="70"/>
-              <w:left w:type="dxa" w:w="120"/>
-              <w:bottom w:type="dxa" w:w="70"/>
-              <w:right w:type="dxa" w:w="120"/>
-            </w:tcMar>
-          </w:tcPr>
-          <w:p>
-            <w:pPr>
-              <w:jc w:val="both"/>
-            </w:pPr>
-            <w:r>
-              <w:rPr>
-                <w:rFonts w:ascii="Arial" w:cs="Arial" w:eastAsia="Arial" w:hAnsi="Arial"/>
-                <w:b w:val="false"/>
-                <w:bCs w:val="false"/>
-                <w:color w:val="333333"/>
-                <w:sz w:val="18"/>
-                <w:szCs w:val="18"/>
-              </w:rPr>
-              <w:t xml:space="preserve">Cruzar calidad_datos_SDE_&lt;periodo&gt;.csv con el histórico</w:t>
+              <w:t xml:space="preserve">Análisis estadístico avanzado</w:t>
+            </w:r>
+          </w:p>
+        </w:tc>
+        <w:tc>
+          <w:tcPr>
+            <w:tcBorders>
+              <w:top w:val="single" w:color="CCCCCC" w:sz="1"/>
+              <w:left w:val="single" w:color="CCCCCC" w:sz="1"/>
+              <w:bottom w:val="single" w:color="CCCCCC" w:sz="1"/>
+              <w:right w:val="single" w:color="CCCCCC" w:sz="1"/>
+            </w:tcBorders>
+            <w:shd w:fill="FFFFFF" w:val="clear"/>
+            <w:tcMar>
+              <w:top w:type="dxa" w:w="70"/>
+              <w:left w:type="dxa" w:w="120"/>
+              <w:bottom w:type="dxa" w:w="70"/>
+              <w:right w:type="dxa" w:w="120"/>
+            </w:tcMar>
+          </w:tcPr>
+          <w:p>
+            <w:pPr>
+              <w:jc w:val="both"/>
+            </w:pPr>
+            <w:r>
+              <w:rPr>
+                <w:rFonts w:ascii="Arial" w:cs="Arial" w:eastAsia="Arial" w:hAnsi="Arial"/>
+                <w:b w:val="false"/>
+                <w:bCs w:val="false"/>
+                <w:color w:val="333333"/>
+                <w:sz w:val="18"/>
+                <w:szCs w:val="18"/>
+              </w:rPr>
+              <w:t xml:space="preserve">Cargar base_unida_SDE_&lt;periodo&gt;.csv en Python o R</w:t>
             </w:r>
           </w:p>
         </w:tc>
@@ -8201,7 +8355,7 @@
               <w:bottom w:val="single" w:color="CCCCCC" w:sz="1"/>
               <w:right w:val="single" w:color="CCCCCC" w:sz="1"/>
             </w:tcBorders>
-            <w:shd w:fill="FFFFFF" w:val="clear"/>
+            <w:shd w:fill="F5F5F5" w:val="clear"/>
             <w:tcMar>
               <w:top w:type="dxa" w:w="70"/>
               <w:left w:type="dxa" w:w="120"/>
@@ -8214,83 +8368,7 @@
               <w:jc w:val="left"/>
             </w:pPr>
             <w:r>
-              <w:rPr>
-                <w:rFonts w:ascii="Courier New" w:cs="Courier New" w:eastAsia="Courier New" w:hAnsi="Courier New"/>
-                <w:b/>
-                <w:bCs/>
-                <w:color w:val="1F3A6E"/>
-                <w:sz w:val="17"/>
-                <w:szCs w:val="17"/>
-              </w:rPr>
-              <w:t xml:space="preserve">Análisis estadístico avanzado</w:t>
-            </w:r>
-          </w:p>
-        </w:tc>
-        <w:tc>
-          <w:tcPr>
-            <w:tcBorders>
-              <w:top w:val="single" w:color="CCCCCC" w:sz="1"/>
-              <w:left w:val="single" w:color="CCCCCC" w:sz="1"/>
-              <w:bottom w:val="single" w:color="CCCCCC" w:sz="1"/>
-              <w:right w:val="single" w:color="CCCCCC" w:sz="1"/>
-            </w:tcBorders>
-            <w:shd w:fill="FFFFFF" w:val="clear"/>
-            <w:tcMar>
-              <w:top w:type="dxa" w:w="70"/>
-              <w:left w:type="dxa" w:w="120"/>
-              <w:bottom w:type="dxa" w:w="70"/>
-              <w:right w:type="dxa" w:w="120"/>
-            </w:tcMar>
-          </w:tcPr>
-          <w:p>
-            <w:pPr>
-              <w:jc w:val="both"/>
-            </w:pPr>
-            <w:r>
-              <w:rPr>
-                <w:rFonts w:ascii="Arial" w:cs="Arial" w:eastAsia="Arial" w:hAnsi="Arial"/>
-                <w:b w:val="false"/>
-                <w:bCs w:val="false"/>
-                <w:color w:val="333333"/>
-                <w:sz w:val="18"/>
-                <w:szCs w:val="18"/>
-              </w:rPr>
-              <w:t xml:space="preserve">Cargar base_unida_SDE_&lt;periodo&gt;.csv en Python o R</w:t>
-            </w:r>
-          </w:p>
-        </w:tc>
-      </w:tr>
-      <w:tr>
-        <w:tc>
-          <w:tcPr>
-            <w:tcBorders>
-              <w:top w:val="single" w:color="CCCCCC" w:sz="1"/>
-              <w:left w:val="single" w:color="CCCCCC" w:sz="1"/>
-              <w:bottom w:val="single" w:color="CCCCCC" w:sz="1"/>
-              <w:right w:val="single" w:color="CCCCCC" w:sz="1"/>
-            </w:tcBorders>
-            <w:shd w:fill="F5F5F5" w:val="clear"/>
-            <w:tcMar>
-              <w:top w:type="dxa" w:w="70"/>
-              <w:left w:type="dxa" w:w="120"/>
-              <w:bottom w:type="dxa" w:w="70"/>
-              <w:right w:type="dxa" w:w="120"/>
-            </w:tcMar>
-          </w:tcPr>
-          <w:p>
-            <w:pPr>
-              <w:jc w:val="left"/>
-            </w:pPr>
-            <w:r>
-              <w:rPr>
-                <w:rFonts w:ascii="Courier New" w:cs="Courier New" w:eastAsia="Courier New" w:hAnsi="Courier New"/>
-                <w:b/>
-                <w:bCs/>
-                <w:color w:val="1F3A6E"/>
-                <w:sz w:val="17"/>
-                <w:szCs w:val="17"/>
-              </w:rPr>
-              <w:t xml:space="preserve">Envío a INDEC nacional / Gobernación</w:t>
+              <w:t>Intercambio institucional</w:t>
             </w:r>
           </w:p>
         </w:tc>
@@ -8419,6 +8497,26 @@
         </w:tc>
       </w:tr>
     </w:tbl>
+    <w:p>
+      <w:r>
+        <w:t>Metadatos, estados y migración</w:t>
+      </w:r>
+    </w:p>
+    <w:p>
+      <w:r>
+        <w:t>Los nombres anteriores tasa_actividad, tasa_empleo y tasa_inactividad se migraron a tasa_actividad_10_mas, tasa_empleo_10_mas y tasa_inactividad_10_mas porque conservan el denominador de población de 10 años y más. Las tasas principales sobre población total usan nombres nuevos y fórmulas documentadas.</w:t>
+      </w:r>
+    </w:p>
+    <w:p>
+      <w:r>
+        <w:t>Todo CSV tiene un .meta.json asociado. estado_periodos.csv registra PENDIENTE, DESCARGADO, PROCESADO, EN_REVISION, VALIDADO, FALLIDO o PUBLICADO. manifest_salidas.json relaciona salidas, clasificación, período, validación y metadatos.</w:t>
+      </w:r>
+    </w:p>
+    <w:p>
+      <w:r>
+        <w:t>calidad_snapshot_SDE.csv contiene controles lógicos agregados para el dashboard sin microdatos: población positiva, tasas en rango, complementariedad, duplicados y disponibilidad de informalidad. No reemplaza el reporte detallado del ETL.</w:t>
+      </w:r>
+    </w:p>
     <w:sectPr>
       <w:headerReference w:type="default" r:id="rId7"/>
       <w:footerReference w:type="default" r:id="rId8"/>

</xml_diff>